<commit_message>
Add the Figure 1 the proposal already referred to
Section 3.1 told the reader that Figure 1 shows the architecture and the
boundary with component 4.3a, and then no figure followed. This inserts it:
the 4.3a / 4.3b split, the shared REST contract, the CMS v4 and PostgreSQL
backend, and the push dispatch path, with a numbered caption.

Nothing else in the document changes, and the figure matches the one carried
as Figure 1 in the final report, so the two agree on the boundary.
</commit_message>
<xml_diff>
--- a/docs/Project_proposal_Ndashi_v3.docx
+++ b/docs/Project_proposal_Ndashi_v3.docx
@@ -1632,6 +1632,338 @@
           <w:szCs w:val="24"/>
         </w:rPr>
         <w:t xml:space="preserve">The system is a client-server architecture with three tiers: the Flutter mobile application, the CMS v4 Laravel backend exposing a REST API [7], and a PostgreSQL database. Figure 1 shows the architecture and the integration boundaries with component 4.3a and with Firebase Cloud Messaging.</w:t>
+      </w:r>
+    </w:p>
+    <w:p>
+      <w:pPr>
+        <w:spacing w:after="120" w:before="240" w:line="360"/>
+        <w:jc w:val="center"/>
+      </w:pPr>
+    </w:p>
+    <w:tbl>
+      <w:tblPr>
+        <w:tblW w:type="dxa" w:w="9000"/>
+        <w:tblBorders>
+          <w:top w:val="single" w:color="auto" w:sz="4"/>
+          <w:left w:val="single" w:color="auto" w:sz="4"/>
+          <w:bottom w:val="single" w:color="auto" w:sz="4"/>
+          <w:right w:val="single" w:color="auto" w:sz="4"/>
+          <w:insideH w:val="single" w:color="auto" w:sz="4"/>
+          <w:insideV w:val="single" w:color="auto" w:sz="4"/>
+        </w:tblBorders>
+      </w:tblPr>
+      <w:tblGrid>
+        <w:gridCol w:w="4500"/>
+        <w:gridCol w:w="4500"/>
+      </w:tblGrid>
+      <w:tr>
+        <w:tc>
+          <w:tcPr>
+            <w:tcW w:type="dxa" w:w="9000"/>
+            <w:gridSpan w:val="2"/>
+            <w:shd w:fill="1F4D78" w:color="auto" w:val="clear"/>
+            <w:vAlign w:val="center"/>
+          </w:tcPr>
+          <w:p>
+            <w:pPr>
+              <w:spacing w:after="40" w:line="276"/>
+              <w:jc w:val="center"/>
+            </w:pPr>
+            <w:r>
+              <w:rPr>
+                <w:rFonts w:ascii="Times New Roman" w:cs="Times New Roman" w:eastAsia="Times New Roman" w:hAnsi="Times New Roman"/>
+                <w:b/>
+                <w:bCs/>
+                <w:color w:val="FFFFFF"/>
+                <w:sz w:val="22"/>
+                <w:szCs w:val="22"/>
+              </w:rPr>
+              <w:t xml:space="preserve">ConferenceCheck Mobile — Flutter application (Android)</w:t>
+            </w:r>
+          </w:p>
+        </w:tc>
+      </w:tr>
+      <w:tr>
+        <w:tc>
+          <w:tcPr>
+            <w:tcW w:type="dxa" w:w="4500"/>
+            <w:shd w:fill="D9D9D9" w:color="auto" w:val="clear"/>
+            <w:vAlign w:val="top"/>
+          </w:tcPr>
+          <w:p>
+            <w:pPr>
+              <w:spacing w:after="40" w:line="276"/>
+              <w:jc w:val="left"/>
+            </w:pPr>
+            <w:r>
+              <w:rPr>
+                <w:rFonts w:ascii="Times New Roman" w:cs="Times New Roman" w:eastAsia="Times New Roman" w:hAnsi="Times New Roman"/>
+                <w:b/>
+                <w:bCs/>
+                <w:sz w:val="20"/>
+                <w:szCs w:val="20"/>
+              </w:rPr>
+              <w:t xml:space="preserve">Component 4.3a — Core Check-in and Sync Engine</w:t>
+            </w:r>
+          </w:p>
+          <w:p>
+            <w:pPr>
+              <w:spacing w:after="40" w:line="276"/>
+              <w:jc w:val="left"/>
+            </w:pPr>
+            <w:r>
+              <w:rPr>
+                <w:rFonts w:ascii="Times New Roman" w:cs="Times New Roman" w:eastAsia="Times New Roman" w:hAnsi="Times New Roman"/>
+                <w:i/>
+                <w:iCs/>
+                <w:sz w:val="18"/>
+                <w:szCs w:val="18"/>
+              </w:rPr>
+              <w:t xml:space="preserve">Sibling component, developed separately — out of scope for this project</w:t>
+            </w:r>
+          </w:p>
+          <w:p>
+            <w:pPr>
+              <w:spacing w:after="20" w:line="276"/>
+              <w:jc w:val="left"/>
+            </w:pPr>
+            <w:r>
+              <w:rPr>
+                <w:rFonts w:ascii="Times New Roman" w:cs="Times New Roman" w:eastAsia="Times New Roman" w:hAnsi="Times New Roman"/>
+                <w:sz w:val="20"/>
+                <w:szCs w:val="20"/>
+              </w:rPr>
+              <w:t xml:space="preserve">• Attendee check-in capture</w:t>
+            </w:r>
+          </w:p>
+          <w:p>
+            <w:pPr>
+              <w:spacing w:after="40" w:line="276"/>
+              <w:jc w:val="left"/>
+            </w:pPr>
+            <w:r>
+              <w:rPr>
+                <w:rFonts w:ascii="Times New Roman" w:cs="Times New Roman" w:eastAsia="Times New Roman" w:hAnsi="Times New Roman"/>
+                <w:sz w:val="20"/>
+                <w:szCs w:val="20"/>
+              </w:rPr>
+              <w:t xml:space="preserve">• Offline synchronisation engine</w:t>
+            </w:r>
+          </w:p>
+        </w:tc>
+        <w:tc>
+          <w:tcPr>
+            <w:tcW w:type="dxa" w:w="4500"/>
+            <w:shd w:fill="2E86AB" w:color="auto" w:val="clear"/>
+            <w:vAlign w:val="top"/>
+          </w:tcPr>
+          <w:p>
+            <w:pPr>
+              <w:spacing w:after="40" w:line="276"/>
+              <w:jc w:val="left"/>
+            </w:pPr>
+            <w:r>
+              <w:rPr>
+                <w:rFonts w:ascii="Times New Roman" w:cs="Times New Roman" w:eastAsia="Times New Roman" w:hAnsi="Times New Roman"/>
+                <w:b/>
+                <w:bCs/>
+                <w:color w:val="FFFFFF"/>
+                <w:sz w:val="20"/>
+                <w:szCs w:val="20"/>
+              </w:rPr>
+              <w:t xml:space="preserve">Component 4.3b — Analytics, Meals and Notifications</w:t>
+            </w:r>
+          </w:p>
+          <w:p>
+            <w:pPr>
+              <w:spacing w:after="40" w:line="276"/>
+              <w:jc w:val="left"/>
+            </w:pPr>
+            <w:r>
+              <w:rPr>
+                <w:rFonts w:ascii="Times New Roman" w:cs="Times New Roman" w:eastAsia="Times New Roman" w:hAnsi="Times New Roman"/>
+                <w:b/>
+                <w:bCs/>
+                <w:i/>
+                <w:iCs/>
+                <w:color w:val="FFFFFF"/>
+                <w:sz w:val="18"/>
+                <w:szCs w:val="18"/>
+              </w:rPr>
+              <w:t xml:space="preserve">This project</w:t>
+            </w:r>
+          </w:p>
+          <w:p>
+            <w:pPr>
+              <w:spacing w:after="20" w:line="276"/>
+              <w:jc w:val="left"/>
+            </w:pPr>
+            <w:r>
+              <w:rPr>
+                <w:rFonts w:ascii="Times New Roman" w:cs="Times New Roman" w:eastAsia="Times New Roman" w:hAnsi="Times New Roman"/>
+                <w:color w:val="FFFFFF"/>
+                <w:sz w:val="20"/>
+                <w:szCs w:val="20"/>
+              </w:rPr>
+              <w:t xml:space="preserve">• Analytics dashboard</w:t>
+            </w:r>
+          </w:p>
+          <w:p>
+            <w:pPr>
+              <w:spacing w:after="20" w:line="276"/>
+              <w:jc w:val="left"/>
+            </w:pPr>
+            <w:r>
+              <w:rPr>
+                <w:rFonts w:ascii="Times New Roman" w:cs="Times New Roman" w:eastAsia="Times New Roman" w:hAnsi="Times New Roman"/>
+                <w:color w:val="FFFFFF"/>
+                <w:sz w:val="20"/>
+                <w:szCs w:val="20"/>
+              </w:rPr>
+              <w:t xml:space="preserve">• Meal voucher scan and redemption</w:t>
+            </w:r>
+          </w:p>
+          <w:p>
+            <w:pPr>
+              <w:spacing w:after="20" w:line="276"/>
+              <w:jc w:val="left"/>
+            </w:pPr>
+            <w:r>
+              <w:rPr>
+                <w:rFonts w:ascii="Times New Roman" w:cs="Times New Roman" w:eastAsia="Times New Roman" w:hAnsi="Times New Roman"/>
+                <w:color w:val="FFFFFF"/>
+                <w:sz w:val="20"/>
+                <w:szCs w:val="20"/>
+              </w:rPr>
+              <w:t xml:space="preserve">• Session capacity and overcrowding alerts</w:t>
+            </w:r>
+          </w:p>
+          <w:p>
+            <w:pPr>
+              <w:spacing w:after="20" w:line="276"/>
+              <w:jc w:val="left"/>
+            </w:pPr>
+            <w:r>
+              <w:rPr>
+                <w:rFonts w:ascii="Times New Roman" w:cs="Times New Roman" w:eastAsia="Times New Roman" w:hAnsi="Times New Roman"/>
+                <w:color w:val="FFFFFF"/>
+                <w:sz w:val="20"/>
+                <w:szCs w:val="20"/>
+              </w:rPr>
+              <w:t xml:space="preserve">• Notification inbox</w:t>
+            </w:r>
+          </w:p>
+          <w:p>
+            <w:pPr>
+              <w:spacing w:after="40" w:line="276"/>
+              <w:jc w:val="left"/>
+            </w:pPr>
+            <w:r>
+              <w:rPr>
+                <w:rFonts w:ascii="Times New Roman" w:cs="Times New Roman" w:eastAsia="Times New Roman" w:hAnsi="Times New Roman"/>
+                <w:color w:val="FFFFFF"/>
+                <w:sz w:val="20"/>
+                <w:szCs w:val="20"/>
+              </w:rPr>
+              <w:t xml:space="preserve">• Reports and CSV export</w:t>
+            </w:r>
+          </w:p>
+        </w:tc>
+      </w:tr>
+      <w:tr>
+        <w:tc>
+          <w:tcPr>
+            <w:tcW w:type="dxa" w:w="9000"/>
+            <w:gridSpan w:val="2"/>
+            <w:shd w:fill="F2F2F2" w:color="auto" w:val="clear"/>
+            <w:vAlign w:val="center"/>
+          </w:tcPr>
+          <w:p>
+            <w:pPr>
+              <w:spacing w:after="40" w:line="276"/>
+              <w:jc w:val="center"/>
+            </w:pPr>
+            <w:r>
+              <w:rPr>
+                <w:rFonts w:ascii="Times New Roman" w:cs="Times New Roman" w:eastAsia="Times New Roman" w:hAnsi="Times New Roman"/>
+                <w:i/>
+                <w:iCs/>
+                <w:sz w:val="18"/>
+                <w:szCs w:val="18"/>
+              </w:rPr>
+              <w:t xml:space="preserve">Shared REST API contract, Sanctum bearer-token authenticated — 4.3b consumes 4.3a’s check-in data as seeded fixtures during independent development</w:t>
+            </w:r>
+          </w:p>
+        </w:tc>
+      </w:tr>
+      <w:tr>
+        <w:tc>
+          <w:tcPr>
+            <w:tcW w:type="dxa" w:w="9000"/>
+            <w:gridSpan w:val="2"/>
+            <w:shd w:fill="1F4D78" w:color="auto" w:val="clear"/>
+            <w:vAlign w:val="center"/>
+          </w:tcPr>
+          <w:p>
+            <w:pPr>
+              <w:spacing w:after="40" w:line="276"/>
+              <w:jc w:val="center"/>
+            </w:pPr>
+            <w:r>
+              <w:rPr>
+                <w:rFonts w:ascii="Times New Roman" w:cs="Times New Roman" w:eastAsia="Times New Roman" w:hAnsi="Times New Roman"/>
+                <w:b/>
+                <w:bCs/>
+                <w:color w:val="FFFFFF"/>
+                <w:sz w:val="20"/>
+                <w:szCs w:val="20"/>
+              </w:rPr>
+              <w:t xml:space="preserve">CMS v4 Laravel REST API + PostgreSQL database (shared backend)</w:t>
+            </w:r>
+          </w:p>
+        </w:tc>
+      </w:tr>
+      <w:tr>
+        <w:tc>
+          <w:tcPr>
+            <w:tcW w:type="dxa" w:w="9000"/>
+            <w:gridSpan w:val="2"/>
+            <w:shd w:fill="F2F2F2" w:color="auto" w:val="clear"/>
+            <w:vAlign w:val="center"/>
+          </w:tcPr>
+          <w:p>
+            <w:pPr>
+              <w:spacing w:after="40" w:line="276"/>
+              <w:jc w:val="center"/>
+            </w:pPr>
+            <w:r>
+              <w:rPr>
+                <w:rFonts w:ascii="Times New Roman" w:cs="Times New Roman" w:eastAsia="Times New Roman" w:hAnsi="Times New Roman"/>
+                <w:i/>
+                <w:iCs/>
+                <w:sz w:val="18"/>
+                <w:szCs w:val="18"/>
+              </w:rPr>
+              <w:t xml:space="preserve">Push dispatch: Laravel → Firebase Cloud Messaging (external service) → device — component 4.3b notifications only</w:t>
+            </w:r>
+          </w:p>
+        </w:tc>
+      </w:tr>
+    </w:tbl>
+    <w:p>
+      <w:pPr>
+        <w:spacing w:after="200" w:line="360"/>
+        <w:jc w:val="center"/>
+      </w:pPr>
+      <w:r>
+        <w:rPr>
+          <w:rFonts w:ascii="Times New Roman" w:cs="Times New Roman" w:eastAsia="Times New Roman" w:hAnsi="Times New Roman"/>
+          <w:i/>
+          <w:iCs/>
+          <w:sz w:val="20"/>
+          <w:szCs w:val="20"/>
+        </w:rPr>
+        <w:t xml:space="preserve">Figure 1. System architecture, showing the CMS v4 / PostgreSQL backend shared by both components, and the boundary between component 4.3a (sibling, out of scope) and component 4.3b (this project).</w:t>
       </w:r>
     </w:p>
     <w:p>
@@ -5342,6 +5674,9 @@
     <w:basedOn w:val="Normal"/>
     <w:next w:val="Normal"/>
     <w:qFormat/>
+    <w:pPr>
+      <w:outlineLvl w:val="0"/>
+    </w:pPr>
     <w:rPr>
       <w:color w:val="2E74B5"/>
       <w:sz w:val="32"/>
@@ -5353,6 +5688,9 @@
     <w:basedOn w:val="Normal"/>
     <w:next w:val="Normal"/>
     <w:qFormat/>
+    <w:pPr>
+      <w:outlineLvl w:val="1"/>
+    </w:pPr>
     <w:rPr>
       <w:color w:val="2E74B5"/>
       <w:sz w:val="26"/>

</xml_diff>